<commit_message>
Update Test plan.docx table to match 6 use cases and repack PA4 zip
</commit_message>
<xml_diff>
--- a/pa/pa4/PA4-Group02/Test plan.docx
+++ b/pa/pa4/PA4-Group02/Test plan.docx
@@ -3161,1002 +3161,313 @@
         </w:tc>
       </w:tr>
       <w:tr>
-        <w:trPr>
-          <w:cantSplit w:val="0"/>
-          <w:tblHeader w:val="0"/>
-        </w:trPr>
         <w:tc>
-          <w:tcPr/>
+          <w:tcPr>
+            <w:tcW w:type="dxa" w:w="1872"/>
+          </w:tcPr>
           <w:p>
-            <w:pPr>
-              <w:rPr>
-                <w:rFonts w:ascii="Arial" w:cs="Arial" w:eastAsia="Arial" w:hAnsi="Arial"/>
-              </w:rPr>
-            </w:pPr>
             <w:r>
-              <w:rPr>
-                <w:rFonts w:ascii="Arial" w:cs="Arial" w:eastAsia="Arial" w:hAnsi="Arial"/>
-                <w:rtl w:val="0"/>
-              </w:rPr>
-              <w:t xml:space="preserve">UC01</w:t>
+              <w:t>UC01</w:t>
             </w:r>
           </w:p>
         </w:tc>
         <w:tc>
-          <w:tcPr/>
+          <w:tcPr>
+            <w:tcW w:type="dxa" w:w="1872"/>
+          </w:tcPr>
           <w:p>
-            <w:pPr>
-              <w:rPr>
-                <w:rFonts w:ascii="Arial" w:cs="Arial" w:eastAsia="Arial" w:hAnsi="Arial"/>
-              </w:rPr>
-            </w:pPr>
             <w:r>
-              <w:rPr>
-                <w:rFonts w:ascii="Arial" w:cs="Arial" w:eastAsia="Arial" w:hAnsi="Arial"/>
-                <w:rtl w:val="0"/>
-              </w:rPr>
-              <w:t xml:space="preserve">Authentication and Security</w:t>
+              <w:t>Authentication &amp; Security</w:t>
             </w:r>
           </w:p>
         </w:tc>
         <w:tc>
-          <w:tcPr/>
+          <w:tcPr>
+            <w:tcW w:type="dxa" w:w="1872"/>
+          </w:tcPr>
           <w:p>
-            <w:pPr>
-              <w:rPr>
-                <w:rFonts w:ascii="Arial" w:cs="Arial" w:eastAsia="Arial" w:hAnsi="Arial"/>
-              </w:rPr>
-            </w:pPr>
             <w:r>
-              <w:rPr>
-                <w:rFonts w:ascii="Arial" w:cs="Arial" w:eastAsia="Arial" w:hAnsi="Arial"/>
-                <w:rtl w:val="0"/>
-              </w:rPr>
-              <w:t xml:space="preserve">Kid, Parent, Admin</w:t>
+              <w:t>Kid, Parent, Admin</w:t>
             </w:r>
           </w:p>
         </w:tc>
         <w:tc>
-          <w:tcPr/>
+          <w:tcPr>
+            <w:tcW w:type="dxa" w:w="1872"/>
+          </w:tcPr>
           <w:p>
-            <w:pPr>
-              <w:rPr>
-                <w:rFonts w:ascii="Arial" w:cs="Arial" w:eastAsia="Arial" w:hAnsi="Arial"/>
-              </w:rPr>
-            </w:pPr>
             <w:r>
-              <w:rPr>
-                <w:rFonts w:ascii="Arial" w:cs="Arial" w:eastAsia="Arial" w:hAnsi="Arial"/>
-                <w:rtl w:val="0"/>
-              </w:rPr>
-              <w:t xml:space="preserve">AUTH-01 to AUTH-09</w:t>
+              <w:t>AUTH-01 to AUTH-09</w:t>
             </w:r>
           </w:p>
         </w:tc>
         <w:tc>
-          <w:tcPr/>
+          <w:tcPr>
+            <w:tcW w:type="dxa" w:w="1872"/>
+          </w:tcPr>
           <w:p>
-            <w:pPr>
-              <w:rPr>
-                <w:rFonts w:ascii="Arial" w:cs="Arial" w:eastAsia="Arial" w:hAnsi="Arial"/>
-              </w:rPr>
-            </w:pPr>
             <w:r>
-              <w:rPr>
-                <w:rFonts w:ascii="Arial" w:cs="Arial" w:eastAsia="Arial" w:hAnsi="Arial"/>
-                <w:rtl w:val="0"/>
-              </w:rPr>
-              <w:t xml:space="preserve">Executed: 8 pass, 1 fail</w:t>
+              <w:t>Executed: 8 pass, 1 fail</w:t>
             </w:r>
           </w:p>
         </w:tc>
       </w:tr>
       <w:tr>
-        <w:trPr>
-          <w:cantSplit w:val="0"/>
-          <w:tblHeader w:val="0"/>
-        </w:trPr>
         <w:tc>
-          <w:tcPr/>
+          <w:tcPr>
+            <w:tcW w:type="dxa" w:w="1872"/>
+          </w:tcPr>
           <w:p>
-            <w:pPr>
-              <w:rPr>
-                <w:rFonts w:ascii="Arial" w:cs="Arial" w:eastAsia="Arial" w:hAnsi="Arial"/>
-              </w:rPr>
-            </w:pPr>
             <w:r>
-              <w:rPr>
-                <w:rFonts w:ascii="Arial" w:cs="Arial" w:eastAsia="Arial" w:hAnsi="Arial"/>
-                <w:rtl w:val="0"/>
-              </w:rPr>
-              <w:t xml:space="preserve">UC02</w:t>
+              <w:t>UC02</w:t>
             </w:r>
           </w:p>
         </w:tc>
         <w:tc>
-          <w:tcPr/>
+          <w:tcPr>
+            <w:tcW w:type="dxa" w:w="1872"/>
+          </w:tcPr>
           <w:p>
-            <w:pPr>
-              <w:rPr>
-                <w:rFonts w:ascii="Arial" w:cs="Arial" w:eastAsia="Arial" w:hAnsi="Arial"/>
-              </w:rPr>
-            </w:pPr>
             <w:r>
-              <w:rPr>
-                <w:rFonts w:ascii="Arial" w:cs="Arial" w:eastAsia="Arial" w:hAnsi="Arial"/>
-                <w:rtl w:val="0"/>
-              </w:rPr>
-              <w:t xml:space="preserve">Subscription, Pricing, and Stripe Payments</w:t>
+              <w:t>Application Features &amp; Payments</w:t>
             </w:r>
           </w:p>
         </w:tc>
         <w:tc>
-          <w:tcPr/>
+          <w:tcPr>
+            <w:tcW w:type="dxa" w:w="1872"/>
+          </w:tcPr>
           <w:p>
-            <w:pPr>
-              <w:rPr>
-                <w:rFonts w:ascii="Arial" w:cs="Arial" w:eastAsia="Arial" w:hAnsi="Arial"/>
-              </w:rPr>
-            </w:pPr>
             <w:r>
-              <w:rPr>
-                <w:rFonts w:ascii="Arial" w:cs="Arial" w:eastAsia="Arial" w:hAnsi="Arial"/>
-                <w:rtl w:val="0"/>
-              </w:rPr>
-              <w:t xml:space="preserve">Kid Free, Kid Pro, Parent</w:t>
+              <w:t>Kid Free, Kid Pro, Parent</w:t>
             </w:r>
           </w:p>
         </w:tc>
         <w:tc>
-          <w:tcPr/>
+          <w:tcPr>
+            <w:tcW w:type="dxa" w:w="1872"/>
+          </w:tcPr>
           <w:p>
-            <w:pPr>
-              <w:rPr>
-                <w:rFonts w:ascii="Arial" w:cs="Arial" w:eastAsia="Arial" w:hAnsi="Arial"/>
-              </w:rPr>
-            </w:pPr>
             <w:r>
-              <w:rPr>
-                <w:rFonts w:ascii="Arial" w:cs="Arial" w:eastAsia="Arial" w:hAnsi="Arial"/>
-                <w:rtl w:val="0"/>
-              </w:rPr>
-              <w:t xml:space="preserve">SUBS-01 to SUBS-06, ERR-03</w:t>
+              <w:t>SUBS-01 to SUBS-06</w:t>
             </w:r>
           </w:p>
         </w:tc>
         <w:tc>
-          <w:tcPr/>
+          <w:tcPr>
+            <w:tcW w:type="dxa" w:w="1872"/>
+          </w:tcPr>
           <w:p>
-            <w:pPr>
-              <w:rPr>
-                <w:rFonts w:ascii="Arial" w:cs="Arial" w:eastAsia="Arial" w:hAnsi="Arial"/>
-              </w:rPr>
-            </w:pPr>
             <w:r>
-              <w:rPr>
-                <w:rFonts w:ascii="Arial" w:cs="Arial" w:eastAsia="Arial" w:hAnsi="Arial"/>
-                <w:rtl w:val="0"/>
-              </w:rPr>
-              <w:t xml:space="preserve">Executed with payment defects: 4 pass, 2 fail</w:t>
+              <w:t>Executed: 4 pass, 2 fail</w:t>
             </w:r>
           </w:p>
         </w:tc>
       </w:tr>
       <w:tr>
-        <w:trPr>
-          <w:cantSplit w:val="0"/>
-          <w:tblHeader w:val="0"/>
-        </w:trPr>
         <w:tc>
-          <w:tcPr/>
+          <w:tcPr>
+            <w:tcW w:type="dxa" w:w="1872"/>
+          </w:tcPr>
           <w:p>
-            <w:pPr>
-              <w:rPr>
-                <w:rFonts w:ascii="Arial" w:cs="Arial" w:eastAsia="Arial" w:hAnsi="Arial"/>
-              </w:rPr>
-            </w:pPr>
             <w:r>
-              <w:rPr>
-                <w:rFonts w:ascii="Arial" w:cs="Arial" w:eastAsia="Arial" w:hAnsi="Arial"/>
-                <w:rtl w:val="0"/>
-              </w:rPr>
-              <w:t xml:space="preserve">UC03</w:t>
+              <w:t>UC03</w:t>
             </w:r>
           </w:p>
         </w:tc>
         <w:tc>
-          <w:tcPr/>
+          <w:tcPr>
+            <w:tcW w:type="dxa" w:w="1872"/>
+          </w:tcPr>
           <w:p>
-            <w:pPr>
-              <w:rPr>
-                <w:rFonts w:ascii="Arial" w:cs="Arial" w:eastAsia="Arial" w:hAnsi="Arial"/>
-              </w:rPr>
-            </w:pPr>
             <w:r>
-              <w:rPr>
-                <w:rFonts w:ascii="Arial" w:cs="Arial" w:eastAsia="Arial" w:hAnsi="Arial"/>
-                <w:rtl w:val="0"/>
-              </w:rPr>
-              <w:t xml:space="preserve">Knowledge Base, File Upload, OCR, and Parsing</w:t>
+              <w:t>Knowledge Base &amp; Parsing</w:t>
             </w:r>
           </w:p>
         </w:tc>
         <w:tc>
-          <w:tcPr/>
+          <w:tcPr>
+            <w:tcW w:type="dxa" w:w="1872"/>
+          </w:tcPr>
           <w:p>
-            <w:pPr>
-              <w:rPr>
-                <w:rFonts w:ascii="Arial" w:cs="Arial" w:eastAsia="Arial" w:hAnsi="Arial"/>
-              </w:rPr>
-            </w:pPr>
             <w:r>
-              <w:rPr>
-                <w:rFonts w:ascii="Arial" w:cs="Arial" w:eastAsia="Arial" w:hAnsi="Arial"/>
-                <w:rtl w:val="0"/>
-              </w:rPr>
-              <w:t xml:space="preserve">Kid Pro, Admin</w:t>
+              <w:t>Kid Pro, Admin</w:t>
             </w:r>
           </w:p>
         </w:tc>
         <w:tc>
-          <w:tcPr/>
+          <w:tcPr>
+            <w:tcW w:type="dxa" w:w="1872"/>
+          </w:tcPr>
           <w:p>
-            <w:pPr>
-              <w:rPr>
-                <w:rFonts w:ascii="Arial" w:cs="Arial" w:eastAsia="Arial" w:hAnsi="Arial"/>
-              </w:rPr>
-            </w:pPr>
             <w:r>
-              <w:rPr>
-                <w:rFonts w:ascii="Arial" w:cs="Arial" w:eastAsia="Arial" w:hAnsi="Arial"/>
-                <w:rtl w:val="0"/>
-              </w:rPr>
-              <w:t xml:space="preserve">PARSE-01 to PARSE-05</w:t>
+              <w:t>PARSE-01 to PARSE-05</w:t>
             </w:r>
           </w:p>
         </w:tc>
         <w:tc>
-          <w:tcPr/>
+          <w:tcPr>
+            <w:tcW w:type="dxa" w:w="1872"/>
+          </w:tcPr>
           <w:p>
-            <w:pPr>
-              <w:rPr>
-                <w:rFonts w:ascii="Arial" w:cs="Arial" w:eastAsia="Arial" w:hAnsi="Arial"/>
-              </w:rPr>
-            </w:pPr>
             <w:r>
-              <w:rPr>
-                <w:rFonts w:ascii="Arial" w:cs="Arial" w:eastAsia="Arial" w:hAnsi="Arial"/>
-                <w:rtl w:val="0"/>
-              </w:rPr>
-              <w:t xml:space="preserve">Executed: 4 pass, 1 fail</w:t>
+              <w:t>Executed: 4 pass, 1 fail</w:t>
             </w:r>
           </w:p>
         </w:tc>
       </w:tr>
       <w:tr>
-        <w:trPr>
-          <w:cantSplit w:val="0"/>
-          <w:tblHeader w:val="0"/>
-        </w:trPr>
         <w:tc>
-          <w:tcPr/>
+          <w:tcPr>
+            <w:tcW w:type="dxa" w:w="1872"/>
+          </w:tcPr>
           <w:p>
-            <w:pPr>
-              <w:rPr>
-                <w:rFonts w:ascii="Arial" w:cs="Arial" w:eastAsia="Arial" w:hAnsi="Arial"/>
-              </w:rPr>
-            </w:pPr>
             <w:r>
-              <w:rPr>
-                <w:rFonts w:ascii="Arial" w:cs="Arial" w:eastAsia="Arial" w:hAnsi="Arial"/>
-                <w:rtl w:val="0"/>
-              </w:rPr>
-              <w:t xml:space="preserve">UC04</w:t>
+              <w:t>UC04</w:t>
             </w:r>
           </w:p>
         </w:tc>
         <w:tc>
-          <w:tcPr/>
+          <w:tcPr>
+            <w:tcW w:type="dxa" w:w="1872"/>
+          </w:tcPr>
           <w:p>
-            <w:pPr>
-              <w:rPr>
-                <w:rFonts w:ascii="Arial" w:cs="Arial" w:eastAsia="Arial" w:hAnsi="Arial"/>
-              </w:rPr>
-            </w:pPr>
             <w:r>
-              <w:rPr>
-                <w:rFonts w:ascii="Arial" w:cs="Arial" w:eastAsia="Arial" w:hAnsi="Arial"/>
-                <w:rtl w:val="0"/>
-              </w:rPr>
-              <w:t xml:space="preserve">Practice Flow and AI Tutor</w:t>
+              <w:t>Practice &amp; Personalization</w:t>
             </w:r>
           </w:p>
         </w:tc>
         <w:tc>
-          <w:tcPr/>
+          <w:tcPr>
+            <w:tcW w:type="dxa" w:w="1872"/>
+          </w:tcPr>
           <w:p>
-            <w:pPr>
-              <w:rPr>
-                <w:rFonts w:ascii="Arial" w:cs="Arial" w:eastAsia="Arial" w:hAnsi="Arial"/>
-              </w:rPr>
-            </w:pPr>
             <w:r>
-              <w:rPr>
-                <w:rFonts w:ascii="Arial" w:cs="Arial" w:eastAsia="Arial" w:hAnsi="Arial"/>
-                <w:rtl w:val="0"/>
-              </w:rPr>
-              <w:t xml:space="preserve">Kid</w:t>
+              <w:t>Kid</w:t>
             </w:r>
           </w:p>
         </w:tc>
         <w:tc>
-          <w:tcPr/>
+          <w:tcPr>
+            <w:tcW w:type="dxa" w:w="1872"/>
+          </w:tcPr>
           <w:p>
-            <w:pPr>
-              <w:rPr>
-                <w:rFonts w:ascii="Arial" w:cs="Arial" w:eastAsia="Arial" w:hAnsi="Arial"/>
-              </w:rPr>
-            </w:pPr>
             <w:r>
-              <w:rPr>
-                <w:rFonts w:ascii="Arial" w:cs="Arial" w:eastAsia="Arial" w:hAnsi="Arial"/>
-                <w:rtl w:val="0"/>
-              </w:rPr>
-              <w:t xml:space="preserve">PRAC-01 to PRAC-05</w:t>
+              <w:t>PRAC-01 to PRAC-05</w:t>
             </w:r>
           </w:p>
         </w:tc>
         <w:tc>
-          <w:tcPr/>
+          <w:tcPr>
+            <w:tcW w:type="dxa" w:w="1872"/>
+          </w:tcPr>
           <w:p>
-            <w:pPr>
-              <w:rPr>
-                <w:rFonts w:ascii="Arial" w:cs="Arial" w:eastAsia="Arial" w:hAnsi="Arial"/>
-              </w:rPr>
-            </w:pPr>
             <w:r>
-              <w:rPr>
-                <w:rFonts w:ascii="Arial" w:cs="Arial" w:eastAsia="Arial" w:hAnsi="Arial"/>
-                <w:rtl w:val="0"/>
-              </w:rPr>
-              <w:t xml:space="preserve">Executed: core practice pass; TTS defect found</w:t>
+              <w:t>Executed: 4 pass, 1 fail</w:t>
             </w:r>
           </w:p>
         </w:tc>
       </w:tr>
       <w:tr>
-        <w:trPr>
-          <w:cantSplit w:val="0"/>
-          <w:tblHeader w:val="0"/>
-        </w:trPr>
         <w:tc>
-          <w:tcPr/>
+          <w:tcPr>
+            <w:tcW w:type="dxa" w:w="1872"/>
+          </w:tcPr>
           <w:p>
-            <w:pPr>
-              <w:rPr>
-                <w:rFonts w:ascii="Arial" w:cs="Arial" w:eastAsia="Arial" w:hAnsi="Arial"/>
-              </w:rPr>
-            </w:pPr>
             <w:r>
-              <w:rPr>
-                <w:rFonts w:ascii="Arial" w:cs="Arial" w:eastAsia="Arial" w:hAnsi="Arial"/>
-                <w:rtl w:val="0"/>
-              </w:rPr>
-              <w:t xml:space="preserve">UC05</w:t>
+              <w:t>UC05</w:t>
             </w:r>
           </w:p>
         </w:tc>
         <w:tc>
-          <w:tcPr/>
+          <w:tcPr>
+            <w:tcW w:type="dxa" w:w="1872"/>
+          </w:tcPr>
           <w:p>
-            <w:pPr>
-              <w:rPr>
-                <w:rFonts w:ascii="Arial" w:cs="Arial" w:eastAsia="Arial" w:hAnsi="Arial"/>
-              </w:rPr>
-            </w:pPr>
             <w:r>
-              <w:rPr>
-                <w:rFonts w:ascii="Arial" w:cs="Arial" w:eastAsia="Arial" w:hAnsi="Arial"/>
-                <w:rtl w:val="0"/>
-              </w:rPr>
-              <w:t xml:space="preserve">Personalization and Weakness Analysis</w:t>
+              <w:t>Gamification &amp; System Admin</w:t>
             </w:r>
           </w:p>
         </w:tc>
         <w:tc>
-          <w:tcPr/>
+          <w:tcPr>
+            <w:tcW w:type="dxa" w:w="1872"/>
+          </w:tcPr>
           <w:p>
-            <w:pPr>
-              <w:rPr>
-                <w:rFonts w:ascii="Arial" w:cs="Arial" w:eastAsia="Arial" w:hAnsi="Arial"/>
-              </w:rPr>
-            </w:pPr>
             <w:r>
-              <w:rPr>
-                <w:rFonts w:ascii="Arial" w:cs="Arial" w:eastAsia="Arial" w:hAnsi="Arial"/>
-                <w:rtl w:val="0"/>
-              </w:rPr>
-              <w:t xml:space="preserve">Kid</w:t>
+              <w:t>Kid, Parent, Admin</w:t>
             </w:r>
           </w:p>
         </w:tc>
         <w:tc>
-          <w:tcPr/>
+          <w:tcPr>
+            <w:tcW w:type="dxa" w:w="1872"/>
+          </w:tcPr>
           <w:p>
-            <w:pPr>
-              <w:rPr>
-                <w:rFonts w:ascii="Arial" w:cs="Arial" w:eastAsia="Arial" w:hAnsi="Arial"/>
-              </w:rPr>
-            </w:pPr>
             <w:r>
-              <w:rPr>
-                <w:rFonts w:ascii="Arial" w:cs="Arial" w:eastAsia="Arial" w:hAnsi="Arial"/>
-                <w:rtl w:val="0"/>
-              </w:rPr>
-              <w:t xml:space="preserve">PERS-01 to PERS-04</w:t>
+              <w:t>GAMI-01 to GAMI-05, FAM-01, ADM-01, ADM-04 to ADM-06</w:t>
             </w:r>
           </w:p>
         </w:tc>
         <w:tc>
-          <w:tcPr/>
+          <w:tcPr>
+            <w:tcW w:type="dxa" w:w="1872"/>
+          </w:tcPr>
           <w:p>
-            <w:pPr>
-              <w:rPr>
-                <w:rFonts w:ascii="Arial" w:cs="Arial" w:eastAsia="Arial" w:hAnsi="Arial"/>
-              </w:rPr>
-            </w:pPr>
             <w:r>
-              <w:rPr>
-                <w:rFonts w:ascii="Arial" w:cs="Arial" w:eastAsia="Arial" w:hAnsi="Arial"/>
-                <w:rtl w:val="0"/>
-              </w:rPr>
-              <w:t xml:space="preserve">Planned/skipped because feature is not fully implemented</w:t>
+              <w:t>Executed: 9 pass, 1 fail</w:t>
             </w:r>
           </w:p>
         </w:tc>
       </w:tr>
       <w:tr>
-        <w:trPr>
-          <w:cantSplit w:val="0"/>
-          <w:tblHeader w:val="0"/>
-        </w:trPr>
         <w:tc>
-          <w:tcPr/>
+          <w:tcPr>
+            <w:tcW w:type="dxa" w:w="1872"/>
+          </w:tcPr>
           <w:p>
-            <w:pPr>
-              <w:rPr>
-                <w:rFonts w:ascii="Arial" w:cs="Arial" w:eastAsia="Arial" w:hAnsi="Arial"/>
-              </w:rPr>
-            </w:pPr>
             <w:r>
-              <w:rPr>
-                <w:rFonts w:ascii="Arial" w:cs="Arial" w:eastAsia="Arial" w:hAnsi="Arial"/>
-                <w:rtl w:val="0"/>
-              </w:rPr>
-              <w:t xml:space="preserve">UC06</w:t>
+              <w:t>UC06</w:t>
             </w:r>
           </w:p>
         </w:tc>
         <w:tc>
-          <w:tcPr/>
+          <w:tcPr>
+            <w:tcW w:type="dxa" w:w="1872"/>
+          </w:tcPr>
           <w:p>
-            <w:pPr>
-              <w:rPr>
-                <w:rFonts w:ascii="Arial" w:cs="Arial" w:eastAsia="Arial" w:hAnsi="Arial"/>
-              </w:rPr>
-            </w:pPr>
             <w:r>
-              <w:rPr>
-                <w:rFonts w:ascii="Arial" w:cs="Arial" w:eastAsia="Arial" w:hAnsi="Arial"/>
-                <w:rtl w:val="0"/>
-              </w:rPr>
-              <w:t xml:space="preserve">Gamification</w:t>
+              <w:t>Bài giảng &amp; Các tính năng khác</w:t>
             </w:r>
           </w:p>
         </w:tc>
         <w:tc>
-          <w:tcPr/>
+          <w:tcPr>
+            <w:tcW w:type="dxa" w:w="1872"/>
+          </w:tcPr>
           <w:p>
-            <w:pPr>
-              <w:rPr>
-                <w:rFonts w:ascii="Arial" w:cs="Arial" w:eastAsia="Arial" w:hAnsi="Arial"/>
-              </w:rPr>
-            </w:pPr>
             <w:r>
-              <w:rPr>
-                <w:rFonts w:ascii="Arial" w:cs="Arial" w:eastAsia="Arial" w:hAnsi="Arial"/>
-                <w:rtl w:val="0"/>
-              </w:rPr>
-              <w:t xml:space="preserve">Kid</w:t>
+              <w:t>Kid, Parent, Admin</w:t>
             </w:r>
           </w:p>
         </w:tc>
         <w:tc>
-          <w:tcPr/>
+          <w:tcPr>
+            <w:tcW w:type="dxa" w:w="1872"/>
+          </w:tcPr>
           <w:p>
-            <w:pPr>
-              <w:rPr>
-                <w:rFonts w:ascii="Arial" w:cs="Arial" w:eastAsia="Arial" w:hAnsi="Arial"/>
-              </w:rPr>
-            </w:pPr>
             <w:r>
-              <w:rPr>
-                <w:rFonts w:ascii="Arial" w:cs="Arial" w:eastAsia="Arial" w:hAnsi="Arial"/>
-                <w:rtl w:val="0"/>
-              </w:rPr>
-              <w:t xml:space="preserve">GAMI-01 to GAMI-05</w:t>
+              <w:t>RAG-01 to RAG-02, PROF-01 to PROF-02, ERR-03</w:t>
             </w:r>
           </w:p>
         </w:tc>
         <w:tc>
-          <w:tcPr/>
+          <w:tcPr>
+            <w:tcW w:type="dxa" w:w="1872"/>
+          </w:tcPr>
           <w:p>
-            <w:pPr>
-              <w:rPr>
-                <w:rFonts w:ascii="Arial" w:cs="Arial" w:eastAsia="Arial" w:hAnsi="Arial"/>
-              </w:rPr>
-            </w:pPr>
             <w:r>
-              <w:rPr>
-                <w:rFonts w:ascii="Arial" w:cs="Arial" w:eastAsia="Arial" w:hAnsi="Arial"/>
-                <w:rtl w:val="0"/>
-              </w:rPr>
-              <w:t xml:space="preserve">Planned or partially executed; several cases untested</w:t>
-            </w:r>
-          </w:p>
-        </w:tc>
-      </w:tr>
-      <w:tr>
-        <w:trPr>
-          <w:cantSplit w:val="0"/>
-          <w:tblHeader w:val="0"/>
-        </w:trPr>
-        <w:tc>
-          <w:tcPr/>
-          <w:p>
-            <w:pPr>
-              <w:rPr>
-                <w:rFonts w:ascii="Arial" w:cs="Arial" w:eastAsia="Arial" w:hAnsi="Arial"/>
-              </w:rPr>
-            </w:pPr>
-            <w:r>
-              <w:rPr>
-                <w:rFonts w:ascii="Arial" w:cs="Arial" w:eastAsia="Arial" w:hAnsi="Arial"/>
-                <w:rtl w:val="0"/>
-              </w:rPr>
-              <w:t xml:space="preserve">UC07</w:t>
-            </w:r>
-          </w:p>
-        </w:tc>
-        <w:tc>
-          <w:tcPr/>
-          <w:p>
-            <w:pPr>
-              <w:rPr>
-                <w:rFonts w:ascii="Arial" w:cs="Arial" w:eastAsia="Arial" w:hAnsi="Arial"/>
-              </w:rPr>
-            </w:pPr>
-            <w:r>
-              <w:rPr>
-                <w:rFonts w:ascii="Arial" w:cs="Arial" w:eastAsia="Arial" w:hAnsi="Arial"/>
-                <w:rtl w:val="0"/>
-              </w:rPr>
-              <w:t xml:space="preserve">Family / Parent Management</w:t>
-            </w:r>
-          </w:p>
-        </w:tc>
-        <w:tc>
-          <w:tcPr/>
-          <w:p>
-            <w:pPr>
-              <w:rPr>
-                <w:rFonts w:ascii="Arial" w:cs="Arial" w:eastAsia="Arial" w:hAnsi="Arial"/>
-              </w:rPr>
-            </w:pPr>
-            <w:r>
-              <w:rPr>
-                <w:rFonts w:ascii="Arial" w:cs="Arial" w:eastAsia="Arial" w:hAnsi="Arial"/>
-                <w:rtl w:val="0"/>
-              </w:rPr>
-              <w:t xml:space="preserve">Parent</w:t>
-            </w:r>
-          </w:p>
-        </w:tc>
-        <w:tc>
-          <w:tcPr/>
-          <w:p>
-            <w:pPr>
-              <w:rPr>
-                <w:rFonts w:ascii="Arial" w:cs="Arial" w:eastAsia="Arial" w:hAnsi="Arial"/>
-              </w:rPr>
-            </w:pPr>
-            <w:r>
-              <w:rPr>
-                <w:rFonts w:ascii="Arial" w:cs="Arial" w:eastAsia="Arial" w:hAnsi="Arial"/>
-                <w:rtl w:val="0"/>
-              </w:rPr>
-              <w:t xml:space="preserve">FAM-01 to FAM-03</w:t>
-            </w:r>
-          </w:p>
-        </w:tc>
-        <w:tc>
-          <w:tcPr/>
-          <w:p>
-            <w:pPr>
-              <w:rPr>
-                <w:rFonts w:ascii="Arial" w:cs="Arial" w:eastAsia="Arial" w:hAnsi="Arial"/>
-              </w:rPr>
-            </w:pPr>
-            <w:r>
-              <w:rPr>
-                <w:rFonts w:ascii="Arial" w:cs="Arial" w:eastAsia="Arial" w:hAnsi="Arial"/>
-                <w:rtl w:val="0"/>
-              </w:rPr>
-              <w:t xml:space="preserve">Partially executed; family state sync defect found</w:t>
-            </w:r>
-          </w:p>
-        </w:tc>
-      </w:tr>
-      <w:tr>
-        <w:trPr>
-          <w:cantSplit w:val="0"/>
-          <w:tblHeader w:val="0"/>
-        </w:trPr>
-        <w:tc>
-          <w:tcPr/>
-          <w:p>
-            <w:pPr>
-              <w:rPr>
-                <w:rFonts w:ascii="Arial" w:cs="Arial" w:eastAsia="Arial" w:hAnsi="Arial"/>
-              </w:rPr>
-            </w:pPr>
-            <w:r>
-              <w:rPr>
-                <w:rFonts w:ascii="Arial" w:cs="Arial" w:eastAsia="Arial" w:hAnsi="Arial"/>
-                <w:rtl w:val="0"/>
-              </w:rPr>
-              <w:t xml:space="preserve">UC08</w:t>
-            </w:r>
-          </w:p>
-        </w:tc>
-        <w:tc>
-          <w:tcPr/>
-          <w:p>
-            <w:pPr>
-              <w:rPr>
-                <w:rFonts w:ascii="Arial" w:cs="Arial" w:eastAsia="Arial" w:hAnsi="Arial"/>
-              </w:rPr>
-            </w:pPr>
-            <w:r>
-              <w:rPr>
-                <w:rFonts w:ascii="Arial" w:cs="Arial" w:eastAsia="Arial" w:hAnsi="Arial"/>
-                <w:rtl w:val="0"/>
-              </w:rPr>
-              <w:t xml:space="preserve">System Administration</w:t>
-            </w:r>
-          </w:p>
-        </w:tc>
-        <w:tc>
-          <w:tcPr/>
-          <w:p>
-            <w:pPr>
-              <w:rPr>
-                <w:rFonts w:ascii="Arial" w:cs="Arial" w:eastAsia="Arial" w:hAnsi="Arial"/>
-              </w:rPr>
-            </w:pPr>
-            <w:r>
-              <w:rPr>
-                <w:rFonts w:ascii="Arial" w:cs="Arial" w:eastAsia="Arial" w:hAnsi="Arial"/>
-                <w:rtl w:val="0"/>
-              </w:rPr>
-              <w:t xml:space="preserve">Admin</w:t>
-            </w:r>
-          </w:p>
-        </w:tc>
-        <w:tc>
-          <w:tcPr/>
-          <w:p>
-            <w:pPr>
-              <w:rPr>
-                <w:rFonts w:ascii="Arial" w:cs="Arial" w:eastAsia="Arial" w:hAnsi="Arial"/>
-              </w:rPr>
-            </w:pPr>
-            <w:r>
-              <w:rPr>
-                <w:rFonts w:ascii="Arial" w:cs="Arial" w:eastAsia="Arial" w:hAnsi="Arial"/>
-                <w:rtl w:val="0"/>
-              </w:rPr>
-              <w:t xml:space="preserve">ADM-01 to ADM-06</w:t>
-            </w:r>
-          </w:p>
-        </w:tc>
-        <w:tc>
-          <w:tcPr/>
-          <w:p>
-            <w:pPr>
-              <w:rPr>
-                <w:rFonts w:ascii="Arial" w:cs="Arial" w:eastAsia="Arial" w:hAnsi="Arial"/>
-              </w:rPr>
-            </w:pPr>
-            <w:r>
-              <w:rPr>
-                <w:rFonts w:ascii="Arial" w:cs="Arial" w:eastAsia="Arial" w:hAnsi="Arial"/>
-                <w:rtl w:val="0"/>
-              </w:rPr>
-              <w:t xml:space="preserve">Partially executed; search/lock workflows not implemented</w:t>
-            </w:r>
-          </w:p>
-        </w:tc>
-      </w:tr>
-      <w:tr>
-        <w:trPr>
-          <w:cantSplit w:val="0"/>
-          <w:tblHeader w:val="0"/>
-        </w:trPr>
-        <w:tc>
-          <w:tcPr/>
-          <w:p>
-            <w:pPr>
-              <w:rPr>
-                <w:rFonts w:ascii="Arial" w:cs="Arial" w:eastAsia="Arial" w:hAnsi="Arial"/>
-              </w:rPr>
-            </w:pPr>
-            <w:r>
-              <w:rPr>
-                <w:rFonts w:ascii="Arial" w:cs="Arial" w:eastAsia="Arial" w:hAnsi="Arial"/>
-                <w:rtl w:val="0"/>
-              </w:rPr>
-              <w:t xml:space="preserve">UC09</w:t>
-            </w:r>
-          </w:p>
-        </w:tc>
-        <w:tc>
-          <w:tcPr/>
-          <w:p>
-            <w:pPr>
-              <w:rPr>
-                <w:rFonts w:ascii="Arial" w:cs="Arial" w:eastAsia="Arial" w:hAnsi="Arial"/>
-              </w:rPr>
-            </w:pPr>
-            <w:r>
-              <w:rPr>
-                <w:rFonts w:ascii="Arial" w:cs="Arial" w:eastAsia="Arial" w:hAnsi="Arial"/>
-                <w:rtl w:val="0"/>
-              </w:rPr>
-              <w:t xml:space="preserve">Lessons and Study Flow</w:t>
-            </w:r>
-          </w:p>
-        </w:tc>
-        <w:tc>
-          <w:tcPr/>
-          <w:p>
-            <w:pPr>
-              <w:rPr>
-                <w:rFonts w:ascii="Arial" w:cs="Arial" w:eastAsia="Arial" w:hAnsi="Arial"/>
-              </w:rPr>
-            </w:pPr>
-            <w:r>
-              <w:rPr>
-                <w:rFonts w:ascii="Arial" w:cs="Arial" w:eastAsia="Arial" w:hAnsi="Arial"/>
-                <w:rtl w:val="0"/>
-              </w:rPr>
-              <w:t xml:space="preserve">Kid</w:t>
-            </w:r>
-          </w:p>
-        </w:tc>
-        <w:tc>
-          <w:tcPr/>
-          <w:p>
-            <w:pPr>
-              <w:rPr>
-                <w:rFonts w:ascii="Arial" w:cs="Arial" w:eastAsia="Arial" w:hAnsi="Arial"/>
-              </w:rPr>
-            </w:pPr>
-            <w:r>
-              <w:rPr>
-                <w:rFonts w:ascii="Arial" w:cs="Arial" w:eastAsia="Arial" w:hAnsi="Arial"/>
-                <w:rtl w:val="0"/>
-              </w:rPr>
-              <w:t xml:space="preserve">STUD-01 to STUD-03</w:t>
-            </w:r>
-          </w:p>
-        </w:tc>
-        <w:tc>
-          <w:tcPr/>
-          <w:p>
-            <w:pPr>
-              <w:rPr>
-                <w:rFonts w:ascii="Arial" w:cs="Arial" w:eastAsia="Arial" w:hAnsi="Arial"/>
-              </w:rPr>
-            </w:pPr>
-            <w:r>
-              <w:rPr>
-                <w:rFonts w:ascii="Arial" w:cs="Arial" w:eastAsia="Arial" w:hAnsi="Arial"/>
-                <w:rtl w:val="0"/>
-              </w:rPr>
-              <w:t xml:space="preserve">Skipped/not implemented in current build</w:t>
-            </w:r>
-          </w:p>
-        </w:tc>
-      </w:tr>
-      <w:tr>
-        <w:trPr>
-          <w:cantSplit w:val="0"/>
-          <w:tblHeader w:val="0"/>
-        </w:trPr>
-        <w:tc>
-          <w:tcPr/>
-          <w:p>
-            <w:pPr>
-              <w:rPr>
-                <w:rFonts w:ascii="Arial" w:cs="Arial" w:eastAsia="Arial" w:hAnsi="Arial"/>
-              </w:rPr>
-            </w:pPr>
-            <w:r>
-              <w:rPr>
-                <w:rFonts w:ascii="Arial" w:cs="Arial" w:eastAsia="Arial" w:hAnsi="Arial"/>
-                <w:rtl w:val="0"/>
-              </w:rPr>
-              <w:t xml:space="preserve">UC10</w:t>
-            </w:r>
-          </w:p>
-        </w:tc>
-        <w:tc>
-          <w:tcPr/>
-          <w:p>
-            <w:pPr>
-              <w:rPr>
-                <w:rFonts w:ascii="Arial" w:cs="Arial" w:eastAsia="Arial" w:hAnsi="Arial"/>
-              </w:rPr>
-            </w:pPr>
-            <w:r>
-              <w:rPr>
-                <w:rFonts w:ascii="Arial" w:cs="Arial" w:eastAsia="Arial" w:hAnsi="Arial"/>
-                <w:rtl w:val="0"/>
-              </w:rPr>
-              <w:t xml:space="preserve">RAG Ingestion and RAG Quiz Generation</w:t>
-            </w:r>
-          </w:p>
-        </w:tc>
-        <w:tc>
-          <w:tcPr/>
-          <w:p>
-            <w:pPr>
-              <w:rPr>
-                <w:rFonts w:ascii="Arial" w:cs="Arial" w:eastAsia="Arial" w:hAnsi="Arial"/>
-              </w:rPr>
-            </w:pPr>
-            <w:r>
-              <w:rPr>
-                <w:rFonts w:ascii="Arial" w:cs="Arial" w:eastAsia="Arial" w:hAnsi="Arial"/>
-                <w:rtl w:val="0"/>
-              </w:rPr>
-              <w:t xml:space="preserve">Admin</w:t>
-            </w:r>
-          </w:p>
-        </w:tc>
-        <w:tc>
-          <w:tcPr/>
-          <w:p>
-            <w:pPr>
-              <w:rPr>
-                <w:rFonts w:ascii="Arial" w:cs="Arial" w:eastAsia="Arial" w:hAnsi="Arial"/>
-              </w:rPr>
-            </w:pPr>
-            <w:r>
-              <w:rPr>
-                <w:rFonts w:ascii="Arial" w:cs="Arial" w:eastAsia="Arial" w:hAnsi="Arial"/>
-                <w:rtl w:val="0"/>
-              </w:rPr>
-              <w:t xml:space="preserve">RAG-01 to RAG-02</w:t>
-            </w:r>
-          </w:p>
-        </w:tc>
-        <w:tc>
-          <w:tcPr/>
-          <w:p>
-            <w:pPr>
-              <w:rPr>
-                <w:rFonts w:ascii="Arial" w:cs="Arial" w:eastAsia="Arial" w:hAnsi="Arial"/>
-              </w:rPr>
-            </w:pPr>
-            <w:r>
-              <w:rPr>
-                <w:rFonts w:ascii="Arial" w:cs="Arial" w:eastAsia="Arial" w:hAnsi="Arial"/>
-                <w:rtl w:val="0"/>
-              </w:rPr>
-              <w:t xml:space="preserve">Planned/not fully executed</w:t>
-            </w:r>
-          </w:p>
-        </w:tc>
-      </w:tr>
-      <w:tr>
-        <w:trPr>
-          <w:cantSplit w:val="0"/>
-          <w:tblHeader w:val="0"/>
-        </w:trPr>
-        <w:tc>
-          <w:tcPr/>
-          <w:p>
-            <w:pPr>
-              <w:rPr>
-                <w:rFonts w:ascii="Arial" w:cs="Arial" w:eastAsia="Arial" w:hAnsi="Arial"/>
-              </w:rPr>
-            </w:pPr>
-            <w:r>
-              <w:rPr>
-                <w:rFonts w:ascii="Arial" w:cs="Arial" w:eastAsia="Arial" w:hAnsi="Arial"/>
-                <w:rtl w:val="0"/>
-              </w:rPr>
-              <w:t xml:space="preserve">UC11</w:t>
-            </w:r>
-          </w:p>
-        </w:tc>
-        <w:tc>
-          <w:tcPr/>
-          <w:p>
-            <w:pPr>
-              <w:rPr>
-                <w:rFonts w:ascii="Arial" w:cs="Arial" w:eastAsia="Arial" w:hAnsi="Arial"/>
-              </w:rPr>
-            </w:pPr>
-            <w:r>
-              <w:rPr>
-                <w:rFonts w:ascii="Arial" w:cs="Arial" w:eastAsia="Arial" w:hAnsi="Arial"/>
-                <w:rtl w:val="0"/>
-              </w:rPr>
-              <w:t xml:space="preserve">Profile Management</w:t>
-            </w:r>
-          </w:p>
-        </w:tc>
-        <w:tc>
-          <w:tcPr/>
-          <w:p>
-            <w:pPr>
-              <w:rPr>
-                <w:rFonts w:ascii="Arial" w:cs="Arial" w:eastAsia="Arial" w:hAnsi="Arial"/>
-              </w:rPr>
-            </w:pPr>
-            <w:r>
-              <w:rPr>
-                <w:rFonts w:ascii="Arial" w:cs="Arial" w:eastAsia="Arial" w:hAnsi="Arial"/>
-                <w:rtl w:val="0"/>
-              </w:rPr>
-              <w:t xml:space="preserve">Kid, Parent</w:t>
-            </w:r>
-          </w:p>
-        </w:tc>
-        <w:tc>
-          <w:tcPr/>
-          <w:p>
-            <w:pPr>
-              <w:rPr>
-                <w:rFonts w:ascii="Arial" w:cs="Arial" w:eastAsia="Arial" w:hAnsi="Arial"/>
-              </w:rPr>
-            </w:pPr>
-            <w:r>
-              <w:rPr>
-                <w:rFonts w:ascii="Arial" w:cs="Arial" w:eastAsia="Arial" w:hAnsi="Arial"/>
-                <w:rtl w:val="0"/>
-              </w:rPr>
-              <w:t xml:space="preserve">PROF-01 to PROF-02</w:t>
-            </w:r>
-          </w:p>
-        </w:tc>
-        <w:tc>
-          <w:tcPr/>
-          <w:p>
-            <w:pPr>
-              <w:rPr>
-                <w:rFonts w:ascii="Arial" w:cs="Arial" w:eastAsia="Arial" w:hAnsi="Arial"/>
-              </w:rPr>
-            </w:pPr>
-            <w:r>
-              <w:rPr>
-                <w:rFonts w:ascii="Arial" w:cs="Arial" w:eastAsia="Arial" w:hAnsi="Arial"/>
-                <w:rtl w:val="0"/>
-              </w:rPr>
-              <w:t xml:space="preserve">Executed: profile view/update pass; parent title UX defect reported</w:t>
+              <w:t>Executed: 3 pass, 2 fail</w:t>
             </w:r>
           </w:p>
         </w:tc>

</xml_diff>